<commit_message>
Bugfix für Schlusstaste bei kommenden Daten
git-svn-id: svn://svn.code.sf.net/p/itelex/code-0/trunk@733 eda8b1fe-747e-4470-9eba-51160ea1b311
</commit_message>
<xml_diff>
--- a/LastenheftTeilnehmerserver.docx
+++ b/LastenheftTeilnehmerserver.docx
@@ -11,8 +11,6 @@
           <w:szCs w:val="72"/>
         </w:rPr>
       </w:pPr>
-      <w:bookmarkStart w:id="0" w:name="_GoBack"/>
-      <w:bookmarkEnd w:id="0"/>
     </w:p>
     <w:p>
       <w:pPr>
@@ -193,7 +191,7 @@
       <w:r>
         <w:fldChar w:fldCharType="separate"/>
       </w:r>
-      <w:hyperlink w:anchor="_Toc478625564" w:history="1">
+      <w:hyperlink w:anchor="_Toc479065484" w:history="1">
         <w:r>
           <w:rPr>
             <w:rStyle w:val="Hyperlink"/>
@@ -230,7 +228,7 @@
           <w:rPr>
             <w:webHidden/>
           </w:rPr>
-          <w:instrText xml:space="preserve"> PAGEREF _Toc478625564 \h </w:instrText>
+          <w:instrText xml:space="preserve"> PAGEREF _Toc479065484 \h </w:instrText>
         </w:r>
         <w:r>
           <w:rPr>
@@ -266,7 +264,7 @@
           <w:szCs w:val="22"/>
         </w:rPr>
       </w:pPr>
-      <w:hyperlink w:anchor="_Toc478625565" w:history="1">
+      <w:hyperlink w:anchor="_Toc479065485" w:history="1">
         <w:r>
           <w:rPr>
             <w:rStyle w:val="Hyperlink"/>
@@ -303,7 +301,7 @@
           <w:rPr>
             <w:webHidden/>
           </w:rPr>
-          <w:instrText xml:space="preserve"> PAGEREF _Toc478625565 \h </w:instrText>
+          <w:instrText xml:space="preserve"> PAGEREF _Toc479065485 \h </w:instrText>
         </w:r>
         <w:r>
           <w:rPr>
@@ -339,7 +337,7 @@
           <w:szCs w:val="22"/>
         </w:rPr>
       </w:pPr>
-      <w:hyperlink w:anchor="_Toc478625566" w:history="1">
+      <w:hyperlink w:anchor="_Toc479065486" w:history="1">
         <w:r>
           <w:rPr>
             <w:rStyle w:val="Hyperlink"/>
@@ -376,7 +374,7 @@
           <w:rPr>
             <w:webHidden/>
           </w:rPr>
-          <w:instrText xml:space="preserve"> PAGEREF _Toc478625566 \h </w:instrText>
+          <w:instrText xml:space="preserve"> PAGEREF _Toc479065486 \h </w:instrText>
         </w:r>
         <w:r>
           <w:rPr>
@@ -412,7 +410,7 @@
           <w:szCs w:val="22"/>
         </w:rPr>
       </w:pPr>
-      <w:hyperlink w:anchor="_Toc478625567" w:history="1">
+      <w:hyperlink w:anchor="_Toc479065487" w:history="1">
         <w:r>
           <w:rPr>
             <w:rStyle w:val="Hyperlink"/>
@@ -449,7 +447,7 @@
           <w:rPr>
             <w:webHidden/>
           </w:rPr>
-          <w:instrText xml:space="preserve"> PAGEREF _Toc478625567 \h </w:instrText>
+          <w:instrText xml:space="preserve"> PAGEREF _Toc479065487 \h </w:instrText>
         </w:r>
         <w:r>
           <w:rPr>
@@ -485,7 +483,7 @@
           <w:szCs w:val="22"/>
         </w:rPr>
       </w:pPr>
-      <w:hyperlink w:anchor="_Toc478625568" w:history="1">
+      <w:hyperlink w:anchor="_Toc479065488" w:history="1">
         <w:r>
           <w:rPr>
             <w:rStyle w:val="Hyperlink"/>
@@ -522,7 +520,7 @@
           <w:rPr>
             <w:webHidden/>
           </w:rPr>
-          <w:instrText xml:space="preserve"> PAGEREF _Toc478625568 \h </w:instrText>
+          <w:instrText xml:space="preserve"> PAGEREF _Toc479065488 \h </w:instrText>
         </w:r>
         <w:r>
           <w:rPr>
@@ -558,7 +556,7 @@
           <w:szCs w:val="22"/>
         </w:rPr>
       </w:pPr>
-      <w:hyperlink w:anchor="_Toc478625569" w:history="1">
+      <w:hyperlink w:anchor="_Toc479065489" w:history="1">
         <w:r>
           <w:rPr>
             <w:rStyle w:val="Hyperlink"/>
@@ -595,7 +593,7 @@
           <w:rPr>
             <w:webHidden/>
           </w:rPr>
-          <w:instrText xml:space="preserve"> PAGEREF _Toc478625569 \h </w:instrText>
+          <w:instrText xml:space="preserve"> PAGEREF _Toc479065489 \h </w:instrText>
         </w:r>
         <w:r>
           <w:rPr>
@@ -631,7 +629,7 @@
           <w:szCs w:val="22"/>
         </w:rPr>
       </w:pPr>
-      <w:hyperlink w:anchor="_Toc478625570" w:history="1">
+      <w:hyperlink w:anchor="_Toc479065490" w:history="1">
         <w:r>
           <w:rPr>
             <w:rStyle w:val="Hyperlink"/>
@@ -668,7 +666,7 @@
           <w:rPr>
             <w:webHidden/>
           </w:rPr>
-          <w:instrText xml:space="preserve"> PAGEREF _Toc478625570 \h </w:instrText>
+          <w:instrText xml:space="preserve"> PAGEREF _Toc479065490 \h </w:instrText>
         </w:r>
         <w:r>
           <w:rPr>
@@ -789,12 +787,12 @@
       <w:pPr>
         <w:pStyle w:val="berschrift1"/>
       </w:pPr>
-      <w:bookmarkStart w:id="1" w:name="_Toc478625564"/>
+      <w:bookmarkStart w:id="0" w:name="_Toc479065484"/>
       <w:r>
         <w:lastRenderedPageBreak/>
         <w:t>Einleitung</w:t>
       </w:r>
-      <w:bookmarkEnd w:id="1"/>
+      <w:bookmarkEnd w:id="0"/>
     </w:p>
     <w:p>
       <w:r>
@@ -819,7 +817,13 @@
     <w:p/>
     <w:p>
       <w:r>
-        <w:t>Die i-Telex-Stationen ermöglichen durch den modularen Aufbau den Anschluss von theoretisch bis zu 99 Fernschreibern an einer Station. Jede Schnittstelle der i-Telex-Station zu einem Fernschreiber hat eine ein- oder zweistellige Nummer (</w:t>
+        <w:t xml:space="preserve">Die i-Telex-Stationen ermöglichen durch den modularen Aufbau den Anschluss von theoretisch bis zu 99 Fernschreibern an einer </w:t>
+      </w:r>
+      <w:r>
+        <w:t>i-Telex-</w:t>
+      </w:r>
+      <w:r>
+        <w:t>Station. Jede Schnittstelle der i-Telex-Station zu einem Fernschreiber hat eine ein- oder zweistellige Nummer (</w:t>
       </w:r>
       <w:r>
         <w:rPr>
@@ -849,22 +853,50 @@
         <w:t xml:space="preserve">Alternativ zur </w:t>
       </w:r>
       <w:r>
-        <w:t>IP-Adresse kann ein Nutzer einen Host-Namen verwenden.</w:t>
+        <w:t>IP-Adresse kann ein Nu</w:t>
+      </w:r>
+      <w:r>
+        <w:t>tzer einen Host-Namen verwenden.</w:t>
       </w:r>
     </w:p>
     <w:p/>
     <w:p>
-      <w:r>
+      <w:pPr>
+        <w:rPr>
+          <w:b/>
+        </w:rPr>
+      </w:pPr>
+      <w:r>
+        <w:rPr>
+          <w:b/>
+        </w:rPr>
         <w:t>Die Bereitstellung eines Verzeichnisses der vergebenen Rufnummern mit zugehörigen IP-Adressen etc. ist Aufgabe des Teilnehmerservers.</w:t>
       </w:r>
     </w:p>
     <w:p/>
     <w:p>
       <w:r>
+        <w:t xml:space="preserve">Die </w:t>
+      </w:r>
+      <w:r>
         <w:t>Einträge des Teilnehmerservers können als HTML-Seite zur Anzeige auf einem Browser oder durch eine (versteckt ablaufende) Datensatzabfrage des Teilnehmerservers durch eine i-Telex-</w:t>
       </w:r>
       <w:r>
-        <w:t>Station erfolgen.</w:t>
+        <w:t xml:space="preserve">Station </w:t>
+      </w:r>
+      <w:r>
+        <w:t xml:space="preserve">abgefragt werden (Beispiel siehe </w:t>
+      </w:r>
+      <w:hyperlink r:id="rId8" w:history="1">
+        <w:r>
+          <w:rPr>
+            <w:rStyle w:val="Hyperlink"/>
+          </w:rPr>
+          <w:t>http://sonnibs.no-ip.org/itelex-tlnverz.cgi?spr=de</w:t>
+        </w:r>
+      </w:hyperlink>
+      <w:r>
+        <w:t>).</w:t>
       </w:r>
     </w:p>
     <w:p/>
@@ -910,22 +942,22 @@
       <w:pPr>
         <w:pStyle w:val="berschrift1"/>
       </w:pPr>
-      <w:bookmarkStart w:id="2" w:name="_Toc478625565"/>
+      <w:bookmarkStart w:id="1" w:name="_Toc479065485"/>
       <w:r>
         <w:lastRenderedPageBreak/>
         <w:t>Funktionale Anforderungen</w:t>
       </w:r>
+      <w:bookmarkEnd w:id="1"/>
+    </w:p>
+    <w:p>
+      <w:pPr>
+        <w:pStyle w:val="berschrift2"/>
+      </w:pPr>
+      <w:bookmarkStart w:id="2" w:name="_Toc479065486"/>
+      <w:r>
+        <w:t>Allgemein</w:t>
+      </w:r>
       <w:bookmarkEnd w:id="2"/>
-    </w:p>
-    <w:p>
-      <w:pPr>
-        <w:pStyle w:val="berschrift2"/>
-      </w:pPr>
-      <w:bookmarkStart w:id="3" w:name="_Toc478625566"/>
-      <w:r>
-        <w:t>Allgemein</w:t>
-      </w:r>
-      <w:bookmarkEnd w:id="3"/>
     </w:p>
     <w:p>
       <w:pPr>
@@ -1199,11 +1231,11 @@
       <w:pPr>
         <w:pStyle w:val="berschrift2"/>
       </w:pPr>
-      <w:bookmarkStart w:id="4" w:name="_Toc478625567"/>
+      <w:bookmarkStart w:id="3" w:name="_Toc479065487"/>
       <w:r>
         <w:t>Schnittstelle über HTTP</w:t>
       </w:r>
-      <w:bookmarkEnd w:id="4"/>
+      <w:bookmarkEnd w:id="3"/>
     </w:p>
     <w:p>
       <w:pPr>
@@ -1255,77 +1287,103 @@
         <w:t xml:space="preserve"> Dabei darf die PIN-Nummer nicht angezeigt werden.</w:t>
       </w:r>
     </w:p>
+    <w:p>
+      <w:pPr>
+        <w:pStyle w:val="berschrift4"/>
+      </w:pPr>
+      <w:r>
+        <w:t>OPTION: Die Sprache der in diesem Abschnitt beschriebenen HTML-Seiten soll von Deutsch auf Englisch umschaltbar sein, indem eine entsprechende Auswahl durch den Nutzer erfolgt.</w:t>
+      </w:r>
+    </w:p>
     <w:p/>
     <w:p>
       <w:pPr>
         <w:pStyle w:val="berschrift2"/>
       </w:pPr>
-      <w:bookmarkStart w:id="5" w:name="_Toc478625568"/>
+      <w:bookmarkStart w:id="4" w:name="_Toc479065488"/>
       <w:r>
         <w:t>Schnittstelle zu i-Telex-Stationen</w:t>
       </w:r>
+      <w:bookmarkEnd w:id="4"/>
+    </w:p>
+    <w:p>
+      <w:r>
+        <w:t>Details des i-Telex-Teilnehmerserver-Protokolls (Datenformate</w:t>
+      </w:r>
+      <w:r>
+        <w:t xml:space="preserve"> der Telegramme</w:t>
+      </w:r>
+      <w:r>
+        <w:t>) sind im Zusatzdokument „</w:t>
+      </w:r>
+      <w:r>
+        <w:t>Communication</w:t>
+      </w:r>
+      <w:r>
+        <w:t xml:space="preserve">Specification“ </w:t>
+      </w:r>
+      <w:r>
+        <w:t xml:space="preserve">im Kapitel 3 </w:t>
+      </w:r>
+      <w:r>
+        <w:t>definiert.</w:t>
+      </w:r>
+    </w:p>
+    <w:p/>
+    <w:p>
+      <w:pPr>
+        <w:pStyle w:val="berschrift4"/>
+      </w:pPr>
+      <w:r>
+        <w:t>Der Teilnehmerserver muss auf ankommende Verbindungen im Port 11811 reagieren.</w:t>
+      </w:r>
+    </w:p>
+    <w:p>
+      <w:pPr>
+        <w:pStyle w:val="berschrift4"/>
+      </w:pPr>
+      <w:r>
+        <w:t>Nach Öffnen der Verbindung wart</w:t>
+      </w:r>
+      <w:r>
+        <w:t>et der Teilnehmerserver auf ein</w:t>
+      </w:r>
+      <w:r>
+        <w:t xml:space="preserve"> </w:t>
+      </w:r>
+      <w:r>
+        <w:t>T</w:t>
+      </w:r>
+      <w:r>
+        <w:t>elegramm von der i-Telex-Station.</w:t>
+      </w:r>
+    </w:p>
+    <w:p>
+      <w:pPr>
+        <w:pStyle w:val="berschrift4"/>
+      </w:pPr>
+      <w:r>
+        <w:t>Bei Empfang eines Telegramms vom Typ „</w:t>
+      </w:r>
+      <w:r>
+        <w:t>Peer_query</w:t>
+      </w:r>
+      <w:r>
+        <w:t>“ muss der Teilnehmerserver anhand der im Telegramm enthaltenen Rufnummer den passenden Teilnehmerdatensatz heraussuchen.</w:t>
+      </w:r>
+    </w:p>
+    <w:p>
+      <w:pPr>
+        <w:pStyle w:val="berschrift5"/>
+      </w:pPr>
+      <w:bookmarkStart w:id="5" w:name="_Ref478641622"/>
+      <w:r>
+        <w:t>Wird ein passender Datensatz gefunden und ist dieser Datensatz nicht mit dem Flag „gesperrt“ versehen, ist der Inhalt des Datensatzes ohne PIN-Nummer als Telegramm vom Typ „Peer_reply_v1“</w:t>
+      </w:r>
+      <w:r>
+        <w:t xml:space="preserve"> zu senden.</w:t>
+      </w:r>
       <w:bookmarkEnd w:id="5"/>
-    </w:p>
-    <w:p>
-      <w:r>
-        <w:t>Details des i-Telex-Teilnehmerserver-Protokolls (Datenformate</w:t>
-      </w:r>
-      <w:r>
-        <w:t xml:space="preserve"> der Telegramme</w:t>
-      </w:r>
-      <w:r>
-        <w:t>) sind im Zusatzdokument „Documentation Specification“ definiert.</w:t>
-      </w:r>
-    </w:p>
-    <w:p/>
-    <w:p>
-      <w:pPr>
-        <w:pStyle w:val="berschrift4"/>
-      </w:pPr>
-      <w:r>
-        <w:t>Der Teilnehmerserver muss auf ankommende Verbindungen im Port 11811 reagieren.</w:t>
-      </w:r>
-    </w:p>
-    <w:p>
-      <w:pPr>
-        <w:pStyle w:val="berschrift4"/>
-      </w:pPr>
-      <w:r>
-        <w:t xml:space="preserve">Nach Öffnen der Verbindung wartet der Teilnehmerserver auf eine </w:t>
-      </w:r>
-      <w:r>
-        <w:t>T</w:t>
-      </w:r>
-      <w:r>
-        <w:t>elegramm von der i-Telex-Station.</w:t>
-      </w:r>
-    </w:p>
-    <w:p>
-      <w:pPr>
-        <w:pStyle w:val="berschrift4"/>
-      </w:pPr>
-      <w:r>
-        <w:t>Bei Empfang eines Telegramms vom Typ „</w:t>
-      </w:r>
-      <w:r>
-        <w:t>Peer_query</w:t>
-      </w:r>
-      <w:r>
-        <w:t>“ muss der Teilnehmerserver anhand der im Telegramm enthaltenen Rufnummer den passenden Teilnehmerdatensatz heraussuchen.</w:t>
-      </w:r>
-    </w:p>
-    <w:p>
-      <w:pPr>
-        <w:pStyle w:val="berschrift5"/>
-      </w:pPr>
-      <w:bookmarkStart w:id="6" w:name="_Ref478641622"/>
-      <w:r>
-        <w:t>Wird ein passender Datensatz gefunden und ist dieser Datensatz nicht mit dem Flag „gesperrt“ versehen, ist der Inhalt des Datensatzes ohne PIN-Nummer als Telegramm vom Typ „Peer_reply_v1“</w:t>
-      </w:r>
-      <w:r>
-        <w:t xml:space="preserve"> zu senden.</w:t>
-      </w:r>
-      <w:bookmarkEnd w:id="6"/>
     </w:p>
     <w:p>
       <w:pPr>
@@ -1435,6 +1493,7 @@
         <w:pStyle w:val="berschrift4"/>
       </w:pPr>
       <w:r>
+        <w:lastRenderedPageBreak/>
         <w:t>B</w:t>
       </w:r>
       <w:r>
@@ -1449,7 +1508,6 @@
         <w:pStyle w:val="berschrift5"/>
       </w:pPr>
       <w:r>
-        <w:lastRenderedPageBreak/>
         <w:t xml:space="preserve">Wird ein passender Datensatz gefunden und ist dieser Datensatz nicht mit dem Flag „gesperrt“ versehen, ist der Inhalt des Datensatzes </w:t>
       </w:r>
       <w:r>
@@ -1550,12 +1608,11 @@
         <w:t>Buchstabenfolge +++</w:t>
       </w:r>
     </w:p>
-    <w:p/>
     <w:p>
       <w:pPr>
         <w:pStyle w:val="berschrift5"/>
       </w:pPr>
-      <w:bookmarkStart w:id="7" w:name="_Ref478641626"/>
+      <w:bookmarkStart w:id="6" w:name="_Ref478641626"/>
       <w:r>
         <w:t xml:space="preserve">Wird </w:t>
       </w:r>
@@ -1568,7 +1625,7 @@
       <w:r>
         <w:t xml:space="preserve"> passender Datensatz gefunden oder ist der gefundene Datensatz mit dem Flag „gesperrt“ versehen, sind folgende Daten zu senden:</w:t>
       </w:r>
-      <w:bookmarkEnd w:id="7"/>
+      <w:bookmarkEnd w:id="6"/>
     </w:p>
     <w:p>
       <w:pPr>
@@ -1614,68 +1671,321 @@
         <w:t>Buchstabenfolge +++</w:t>
       </w:r>
     </w:p>
+    <w:p>
+      <w:pPr>
+        <w:pStyle w:val="berschrift5"/>
+        <w:tabs>
+          <w:tab w:val="clear" w:pos="1008"/>
+        </w:tabs>
+        <w:ind w:left="1134" w:hanging="1134"/>
+      </w:pPr>
+      <w:r>
+        <w:t xml:space="preserve">Nachdem entsprechend der Anforderungen </w:t>
+      </w:r>
+      <w:r>
+        <w:fldChar w:fldCharType="begin"/>
+      </w:r>
+      <w:r>
+        <w:instrText xml:space="preserve"> REF _Ref478641622 \r \h </w:instrText>
+      </w:r>
+      <w:r>
+        <w:instrText xml:space="preserve"> \* MERGEFORMAT </w:instrText>
+      </w:r>
+      <w:r>
+        <w:fldChar w:fldCharType="separate"/>
+      </w:r>
+      <w:r>
+        <w:t>2.3.1.</w:t>
+      </w:r>
+      <w:r>
+        <w:t>3</w:t>
+      </w:r>
+      <w:r>
+        <w:t>.1</w:t>
+      </w:r>
+      <w:r>
+        <w:fldChar w:fldCharType="end"/>
+      </w:r>
+      <w:r>
+        <w:t xml:space="preserve"> bis </w:t>
+      </w:r>
+      <w:r>
+        <w:fldChar w:fldCharType="begin"/>
+      </w:r>
+      <w:r>
+        <w:instrText xml:space="preserve"> REF _Ref478641626 \r \h </w:instrText>
+      </w:r>
+      <w:r>
+        <w:instrText xml:space="preserve"> \* MERGEFORMAT </w:instrText>
+      </w:r>
+      <w:r>
+        <w:fldChar w:fldCharType="separate"/>
+      </w:r>
+      <w:r>
+        <w:t>2.</w:t>
+      </w:r>
+      <w:r>
+        <w:t>3</w:t>
+      </w:r>
+      <w:r>
+        <w:t>.1.5.2</w:t>
+      </w:r>
+      <w:r>
+        <w:fldChar w:fldCharType="end"/>
+      </w:r>
+      <w:r>
+        <w:t xml:space="preserve"> </w:t>
+      </w:r>
+      <w:r>
+        <w:t xml:space="preserve">oder </w:t>
+      </w:r>
+      <w:r>
+        <w:fldChar w:fldCharType="begin"/>
+      </w:r>
+      <w:r>
+        <w:instrText xml:space="preserve"> REF _Ref479168661 \r \h </w:instrText>
+      </w:r>
+      <w:r>
+        <w:fldChar w:fldCharType="separate"/>
+      </w:r>
+      <w:r>
+        <w:t>2.3.1.7.1</w:t>
+      </w:r>
+      <w:r>
+        <w:fldChar w:fldCharType="end"/>
+      </w:r>
+      <w:r>
+        <w:t xml:space="preserve"> oder </w:t>
+      </w:r>
+      <w:r>
+        <w:fldChar w:fldCharType="begin"/>
+      </w:r>
+      <w:r>
+        <w:instrText xml:space="preserve"> REF _Ref479168664 \r \h </w:instrText>
+      </w:r>
+      <w:r>
+        <w:fldChar w:fldCharType="separate"/>
+      </w:r>
+      <w:r>
+        <w:t>2.3.1.7.4</w:t>
+      </w:r>
+      <w:r>
+        <w:fldChar w:fldCharType="end"/>
+      </w:r>
+      <w:r>
+        <w:t xml:space="preserve"> </w:t>
+      </w:r>
+      <w:r>
+        <w:t xml:space="preserve">eine Rückmeldung gegeben würde, ist der TCP-Socket nach 2 bis 5 Sekunden zu schließen. In diesem Zeitraum eintreffende Anfragen </w:t>
+      </w:r>
+      <w:r>
+        <w:t xml:space="preserve">sollten aber </w:t>
+      </w:r>
+      <w:r>
+        <w:t>bearbeitet werden.</w:t>
+      </w:r>
+    </w:p>
+    <w:p>
+      <w:pPr>
+        <w:pStyle w:val="berschrift4"/>
+      </w:pPr>
+      <w:r>
+        <w:t>Über den Port 11811 müssen mehrere Verbindungen gleichzeitig bearbeitet werden können.</w:t>
+      </w:r>
+    </w:p>
+    <w:p>
+      <w:pPr>
+        <w:pStyle w:val="berschrift4"/>
+      </w:pPr>
+      <w:r>
+        <w:t>Bei Empfang eines Telegramms vom Typ „</w:t>
+      </w:r>
+      <w:r>
+        <w:t>Peer_search</w:t>
+      </w:r>
+      <w:r>
+        <w:t>“ muss der Teilnehmerserver anhand de</w:t>
+      </w:r>
+      <w:r>
+        <w:t>s</w:t>
+      </w:r>
+      <w:r>
+        <w:t xml:space="preserve"> im Telegramm enthaltenen </w:t>
+      </w:r>
+      <w:r>
+        <w:t xml:space="preserve">Suchmusters alle </w:t>
+      </w:r>
+      <w:r>
+        <w:t>passenden Teilnehmerdatens</w:t>
+      </w:r>
+      <w:r>
+        <w:t>ätze</w:t>
+      </w:r>
+      <w:r>
+        <w:t xml:space="preserve"> heraussuchen.</w:t>
+      </w:r>
+      <w:r>
+        <w:t xml:space="preserve"> Passend bedeutet, dass das Suchmuster an beliebiger Stelle in dem Feld „Name des Teilnehmers“ erscheinen muss. Groß/Kleinschreibung ist nicht zu beachten.</w:t>
+      </w:r>
+    </w:p>
+    <w:p>
+      <w:pPr>
+        <w:pStyle w:val="berschrift5"/>
+      </w:pPr>
+      <w:bookmarkStart w:id="7" w:name="_Ref479168661"/>
+      <w:r>
+        <w:t xml:space="preserve">Wird </w:t>
+      </w:r>
+      <w:r>
+        <w:rPr>
+          <w:u w:val="single"/>
+        </w:rPr>
+        <w:t>kein</w:t>
+      </w:r>
+      <w:r>
+        <w:t xml:space="preserve"> passender Datensatz gefunden, </w:t>
+      </w:r>
+      <w:r>
+        <w:t xml:space="preserve">so </w:t>
+      </w:r>
+      <w:r>
+        <w:t xml:space="preserve">ist </w:t>
+      </w:r>
+      <w:r>
+        <w:t>das Telegramm „End_of_List“ zu senden</w:t>
+      </w:r>
+      <w:r>
+        <w:t>.</w:t>
+      </w:r>
+      <w:bookmarkEnd w:id="7"/>
+    </w:p>
+    <w:p>
+      <w:pPr>
+        <w:pStyle w:val="berschrift5"/>
+      </w:pPr>
+      <w:r>
+        <w:t xml:space="preserve">Werden passende </w:t>
+      </w:r>
+      <w:r>
+        <w:t>Datens</w:t>
+      </w:r>
+      <w:r>
+        <w:t>ä</w:t>
+      </w:r>
+      <w:r>
+        <w:t>tz</w:t>
+      </w:r>
+      <w:r>
+        <w:t xml:space="preserve">e gefunden, so ist der Inhalt des ersten </w:t>
+      </w:r>
+      <w:r>
+        <w:t>Datensatzes ohne PIN-Nummer als Telegramm vom Typ „Peer_reply_v1“ zu senden.</w:t>
+      </w:r>
+      <w:r>
+        <w:t xml:space="preserve"> Danach ist auf eine Rückmeldung des Clients zu warten.</w:t>
+      </w:r>
+    </w:p>
+    <w:p>
+      <w:pPr>
+        <w:pStyle w:val="berschrift5"/>
+      </w:pPr>
+      <w:r>
+        <w:t xml:space="preserve">Antwortet der Client mit dem Telegramm „Acknowledged“ und liegen weitere passende Datensätze vor, so ist der </w:t>
+      </w:r>
+      <w:r>
+        <w:t xml:space="preserve">Inhalt des </w:t>
+      </w:r>
+      <w:r>
+        <w:t xml:space="preserve">nächsten </w:t>
+      </w:r>
+      <w:r>
+        <w:t>Datensatzes ohne PIN-Nummer als Telegramm vom Typ „Peer_reply_v1“ zu senden.</w:t>
+      </w:r>
+    </w:p>
+    <w:p>
+      <w:pPr>
+        <w:pStyle w:val="berschrift5"/>
+      </w:pPr>
+      <w:bookmarkStart w:id="8" w:name="_Ref479168664"/>
+      <w:r>
+        <w:t xml:space="preserve">Antwortet der Client mit dem Telegramm „Acknowledged“ und liegen </w:t>
+      </w:r>
+      <w:r>
+        <w:rPr>
+          <w:u w:val="single"/>
+        </w:rPr>
+        <w:t>keine</w:t>
+      </w:r>
+      <w:r>
+        <w:t xml:space="preserve"> </w:t>
+      </w:r>
+      <w:r>
+        <w:t>weitere</w:t>
+      </w:r>
+      <w:r>
+        <w:t>n</w:t>
+      </w:r>
+      <w:r>
+        <w:t xml:space="preserve"> passende</w:t>
+      </w:r>
+      <w:r>
+        <w:t>n</w:t>
+      </w:r>
+      <w:r>
+        <w:t xml:space="preserve"> Datensätze vor, so so ist das Telegramm „End_of_List“ zu senden.</w:t>
+      </w:r>
+      <w:bookmarkEnd w:id="8"/>
+    </w:p>
     <w:p/>
     <w:p>
       <w:pPr>
+        <w:pStyle w:val="berschrift5"/>
+      </w:pPr>
+      <w:r>
+        <w:lastRenderedPageBreak/>
+        <w:t xml:space="preserve">Antwortet der Client </w:t>
+      </w:r>
+      <w:r>
+        <w:rPr>
+          <w:u w:val="single"/>
+        </w:rPr>
+        <w:t>nicht</w:t>
+      </w:r>
+      <w:r>
+        <w:t xml:space="preserve"> </w:t>
+      </w:r>
+      <w:r>
+        <w:t>mit dem Telegramm „Acknowledged“</w:t>
+      </w:r>
+      <w:r>
+        <w:t xml:space="preserve"> so ist die Verbindung abzubauen.</w:t>
+      </w:r>
+    </w:p>
+    <w:p/>
+    <w:p>
+      <w:pPr>
+        <w:pStyle w:val="berschrift2"/>
+      </w:pPr>
+      <w:bookmarkStart w:id="9" w:name="_Toc479065489"/>
+      <w:r>
+        <w:t>Konfiguration</w:t>
+      </w:r>
+      <w:bookmarkEnd w:id="9"/>
+    </w:p>
+    <w:p>
+      <w:pPr>
         <w:pStyle w:val="berschrift4"/>
       </w:pPr>
       <w:r>
-        <w:t xml:space="preserve">Nachdem entsprechend der Anforderungen </w:t>
-      </w:r>
-      <w:r>
-        <w:fldChar w:fldCharType="begin"/>
-      </w:r>
-      <w:r>
-        <w:instrText xml:space="preserve"> REF _Ref478641622 \r \h </w:instrText>
-      </w:r>
-      <w:r>
-        <w:fldChar w:fldCharType="separate"/>
-      </w:r>
-      <w:r>
-        <w:t>2.3.1.3.1</w:t>
-      </w:r>
-      <w:r>
-        <w:fldChar w:fldCharType="end"/>
-      </w:r>
-      <w:r>
-        <w:t xml:space="preserve"> bis </w:t>
-      </w:r>
-      <w:r>
-        <w:fldChar w:fldCharType="begin"/>
-      </w:r>
-      <w:r>
-        <w:instrText xml:space="preserve"> REF _Ref478641626 \r \h </w:instrText>
-      </w:r>
-      <w:r>
-        <w:fldChar w:fldCharType="separate"/>
-      </w:r>
-      <w:r>
-        <w:t>2.3.1.5.2</w:t>
-      </w:r>
-      <w:r>
-        <w:fldChar w:fldCharType="end"/>
-      </w:r>
-      <w:r>
-        <w:t xml:space="preserve"> eine Rückmeldung gegeben würde, ist der TCP-Socket nach 2 bis 5 Sekunden zu schließen. In diesem Zeitraum eintreffende Anfragen dürfen bearbeitet werden.</w:t>
-      </w:r>
-    </w:p>
-    <w:p/>
-    <w:p>
-      <w:pPr>
-        <w:pStyle w:val="berschrift2"/>
-      </w:pPr>
-      <w:bookmarkStart w:id="8" w:name="_Toc478625569"/>
-      <w:r>
-        <w:t>Konfiguration</w:t>
-      </w:r>
-      <w:bookmarkEnd w:id="8"/>
+        <w:t>Alle Eingaben zur Konfiguration müssen über HTML-Seiten erfolgen können. Die Seiten sind mit Passwort gegen unerwünschten Zugriff zu schützen.</w:t>
+      </w:r>
     </w:p>
     <w:p>
       <w:pPr>
         <w:pStyle w:val="berschrift4"/>
       </w:pPr>
       <w:r>
-        <w:t>Alle Eingaben zur Konfiguration müssen über HTML-Seiten erfolgen können. Die Seiten sind mit Passwort gegen unerwünschten Zugriff zu schützen.</w:t>
+        <w:t>Das Passwort für den Zugriffsschutz muss änderbar sein.</w:t>
       </w:r>
     </w:p>
     <w:p>
@@ -1683,7 +1993,13 @@
         <w:pStyle w:val="berschrift4"/>
       </w:pPr>
       <w:r>
-        <w:t>Das Passwort für den Zugriffsschutz muss änderbar sein.</w:t>
+        <w:t xml:space="preserve">Die </w:t>
+      </w:r>
+      <w:r>
+        <w:t>Adressen der Teilnehmerserver</w:t>
+      </w:r>
+      <w:r>
+        <w:t>, mit denen ein Abgleich der Daten erfolgen soll, müssen änderbar sein. Hinweis: Kommende Verbindungen von anderen Teilnehmerservern sollen immer bearbeitet werden, sofern die Authentifizierung erfolgreich war, d.h. eine Prüfung der Absenderadresse gegen die Liste der verbundenen Server soll nicht erfolgen.</w:t>
       </w:r>
     </w:p>
     <w:p>
@@ -1691,13 +2007,19 @@
         <w:pStyle w:val="berschrift4"/>
       </w:pPr>
       <w:r>
-        <w:t xml:space="preserve">Die </w:t>
-      </w:r>
-      <w:r>
-        <w:t>Adressen der Teilnehmerserver</w:t>
-      </w:r>
-      <w:r>
-        <w:t>, mit denen ein Abgleich der Daten erfolgen soll, müssen änderbar sein. Hinweis: Kommende Verbindungen von anderen Teilnehmerservern sollen immer bearbeitet werden, sofern die Authentifizierung erfolgreich war, d.h. eine Prüfung der Absenderadresse gegen die Liste der verbundenen Server soll nicht erfolgen.</w:t>
+        <w:t xml:space="preserve">Das </w:t>
+      </w:r>
+      <w:r>
+        <w:t xml:space="preserve">Kennwort für </w:t>
+      </w:r>
+      <w:r>
+        <w:t xml:space="preserve">den </w:t>
+      </w:r>
+      <w:r>
+        <w:t>Abgleich</w:t>
+      </w:r>
+      <w:r>
+        <w:t xml:space="preserve"> der Teilnehmerserver untereinander muss änderbar sein.</w:t>
       </w:r>
     </w:p>
     <w:p>
@@ -1705,32 +2027,24 @@
         <w:pStyle w:val="berschrift4"/>
       </w:pPr>
       <w:r>
-        <w:t xml:space="preserve">Das </w:t>
-      </w:r>
-      <w:r>
-        <w:t xml:space="preserve">Kennwort für </w:t>
-      </w:r>
-      <w:r>
-        <w:t xml:space="preserve">den </w:t>
-      </w:r>
-      <w:r>
-        <w:t>Abgleich</w:t>
-      </w:r>
-      <w:r>
-        <w:t xml:space="preserve"> der Teilnehmerserver untereinander muss änderbar sein.</w:t>
-      </w:r>
-    </w:p>
-    <w:p/>
+        <w:t>Konfigurationsänderungen wirken stets nur lokal.</w:t>
+      </w:r>
+    </w:p>
     <w:p>
       <w:pPr>
         <w:pStyle w:val="berschrift1"/>
       </w:pPr>
-      <w:bookmarkStart w:id="9" w:name="_Toc478625570"/>
+      <w:bookmarkStart w:id="10" w:name="_Toc479065490"/>
       <w:r>
         <w:lastRenderedPageBreak/>
-        <w:t>Sonstige Anforderungen</w:t>
-      </w:r>
-      <w:bookmarkEnd w:id="9"/>
+        <w:t>Sonstige Anforderu</w:t>
+      </w:r>
+      <w:bookmarkStart w:id="11" w:name="_GoBack"/>
+      <w:bookmarkEnd w:id="11"/>
+      <w:r>
+        <w:t>ngen</w:t>
+      </w:r>
+      <w:bookmarkEnd w:id="10"/>
     </w:p>
     <w:p>
       <w:pPr>
@@ -1801,6 +2115,9 @@
       <w:r>
         <w:t>.</w:t>
       </w:r>
+      <w:r>
+        <w:t xml:space="preserve"> Erläuterungen durch den Autor sind möglich.</w:t>
+      </w:r>
     </w:p>
     <w:p>
       <w:pPr>
@@ -1817,12 +2134,20 @@
       </w:r>
       <w:r>
         <w:t>auch wenig erfahrenen Nutzern die Installation und ein Update zu ermöglichen.</w:t>
+      </w:r>
+    </w:p>
+    <w:p>
+      <w:pPr>
+        <w:pStyle w:val="berschrift4"/>
+      </w:pPr>
+      <w:r>
+        <w:t>Vor Beginn der Implementierung ist ein Realisierungskonzept vorzulegen.</w:t>
       </w:r>
     </w:p>
     <w:p/>
     <w:sectPr>
-      <w:headerReference w:type="default" r:id="rId8"/>
-      <w:footerReference w:type="default" r:id="rId9"/>
+      <w:headerReference w:type="default" r:id="rId9"/>
+      <w:footerReference w:type="default" r:id="rId10"/>
       <w:pgSz w:w="11906" w:h="16838"/>
       <w:pgMar w:top="1417" w:right="1417" w:bottom="1134" w:left="1417" w:header="708" w:footer="708" w:gutter="0"/>
       <w:cols w:space="708"/>
@@ -1874,7 +2199,7 @@
       <w:rPr>
         <w:noProof/>
       </w:rPr>
-      <w:t>1</w:t>
+      <w:t>7</w:t>
     </w:r>
     <w:r>
       <w:fldChar w:fldCharType="end"/>
@@ -1888,7 +2213,7 @@
         <w:rPr>
           <w:noProof/>
         </w:rPr>
-        <w:t>30.03.2017 13:00:00</w:t>
+        <w:t>04.04.2017 10:39:00</w:t>
       </w:r>
     </w:fldSimple>
   </w:p>
@@ -6206,6 +6531,9 @@
   <w:num w:numId="44">
     <w:abstractNumId w:val="22"/>
   </w:num>
+  <w:num w:numId="45">
+    <w:abstractNumId w:val="22"/>
+  </w:num>
 </w:numbering>
 </file>
 
@@ -6226,7 +6554,7 @@
     <w:lsdException w:name="heading 2" w:uiPriority="9" w:qFormat="1"/>
     <w:lsdException w:name="heading 3" w:uiPriority="9" w:qFormat="1"/>
     <w:lsdException w:name="heading 4" w:uiPriority="0" w:qFormat="1"/>
-    <w:lsdException w:name="heading 5" w:uiPriority="9" w:qFormat="1"/>
+    <w:lsdException w:name="heading 5" w:uiPriority="0" w:qFormat="1"/>
     <w:lsdException w:name="heading 6" w:uiPriority="9" w:qFormat="1"/>
     <w:lsdException w:name="heading 7" w:uiPriority="9" w:qFormat="1"/>
     <w:lsdException w:name="heading 8" w:uiPriority="9" w:qFormat="1"/>
@@ -6700,11 +7028,9 @@
         <w:numId w:val="38"/>
       </w:numPr>
       <w:tabs>
-        <w:tab w:val="clear" w:pos="1008"/>
         <w:tab w:val="left" w:pos="1134"/>
       </w:tabs>
       <w:spacing w:before="240" w:after="60"/>
-      <w:ind w:left="1134" w:hanging="1134"/>
       <w:outlineLvl w:val="4"/>
     </w:pPr>
     <w:rPr>
@@ -7053,6 +7379,17 @@
       <w:noProof/>
     </w:rPr>
   </w:style>
+  <w:style w:type="character" w:styleId="BesuchterLink">
+    <w:name w:val="FollowedHyperlink"/>
+    <w:uiPriority w:val="99"/>
+    <w:semiHidden/>
+    <w:unhideWhenUsed/>
+    <w:rsid w:val="00F06AEF"/>
+    <w:rPr>
+      <w:color w:val="954F72"/>
+      <w:u w:val="single"/>
+    </w:rPr>
+  </w:style>
 </w:styles>
 </file>
 
@@ -7356,7 +7693,7 @@
 </file>
 
 <file path=customXml/itemProps1.xml><?xml version="1.0" encoding="utf-8"?>
-<ds:datastoreItem xmlns:ds="http://schemas.openxmlformats.org/officeDocument/2006/customXml" ds:itemID="{FABD1C39-8BFB-4BE5-B614-1AD81D471175}">
+<ds:datastoreItem xmlns:ds="http://schemas.openxmlformats.org/officeDocument/2006/customXml" ds:itemID="{F63EA883-DF8D-4BC8-B2E1-D2A64ADA2BF8}">
   <ds:schemaRefs>
     <ds:schemaRef ds:uri="http://schemas.openxmlformats.org/officeDocument/2006/bibliography"/>
   </ds:schemaRefs>

</xml_diff>